<commit_message>
Refine Phase 2 report and add focused topic and direct-reply supplements
</commit_message>
<xml_diff>
--- a/分析报告_Phase2_中文新版.docx
+++ b/分析报告_Phase2_中文新版.docx
@@ -91,7 +91,7 @@
           <w:b w:val="0"/>
           <w:i w:val="0"/>
         </w:rPr>
-        <w:t>评论分析呈现出另一类较为清晰的样本内特征：评论普遍较短，其他用户更常使用鼓励或赞许词，帖主更常使用感谢词；明确回复主要由帖主发出，互动接收也较为集中。这些发现共同描绘了围绕帖主展开的交流，但尚不足以证明存在固定的“鼓励—感谢”回应链条，更不能据此判断交流质量、运动坚持或平台留存已经改善。[5][6]</w:t>
+        <w:t>评论分析呈现出另一类较为清晰的样本内特征：评论普遍较短，其他用户更常使用鼓励或赞许词，帖主更常使用感谢词；明确回复主要由帖主发出，互动接收也较为集中。直接配对进一步发现，部分鼓励或赞许用语之后可以观察到帖主的感谢表达，但感谢词命中率较高并未伴随更高的直接回复观察比例。这些结果描绘了围绕帖主展开的交流，尚不能证明普遍的语义回应机制，也不能据此判断交流质量、运动坚持或平台留存已经改善。[5][6][10]</w:t>
       </w:r>
     </w:p>
     <w:p>
@@ -271,8 +271,22 @@
     <w:p>
       <w:pPr>
         <w:spacing w:after="40" w:line="288" w:lineRule="auto"/>
+        <w:ind w:left="283"/>
       </w:pPr>
       <w:hyperlink w:anchor="heading_12">
+        <w:r>
+          <w:rPr>
+            <w:color w:val="32617F"/>
+          </w:rPr>
+          <w:t>4.5 作者等权后主要内容格局保持稳定，部分小主题占比收缩</w:t>
+        </w:r>
+      </w:hyperlink>
+    </w:p>
+    <w:p>
+      <w:pPr>
+        <w:spacing w:after="40" w:line="288" w:lineRule="auto"/>
+      </w:pPr>
+      <w:hyperlink w:anchor="heading_13">
         <w:r>
           <w:rPr>
             <w:color w:val="32617F"/>
@@ -286,7 +300,7 @@
         <w:spacing w:after="40" w:line="288" w:lineRule="auto"/>
         <w:ind w:left="283"/>
       </w:pPr>
-      <w:hyperlink w:anchor="heading_13">
+      <w:hyperlink w:anchor="heading_14">
         <w:r>
           <w:rPr>
             <w:color w:val="32617F"/>
@@ -300,12 +314,12 @@
         <w:spacing w:after="40" w:line="288" w:lineRule="auto"/>
         <w:ind w:left="283"/>
       </w:pPr>
-      <w:hyperlink w:anchor="heading_14">
+      <w:hyperlink w:anchor="heading_15">
         <w:r>
           <w:rPr>
             <w:color w:val="32617F"/>
           </w:rPr>
-          <w:t>5.2 发言角色对应不同表达，但尚未验证固定回应链条</w:t>
+          <w:t>5.2 发言角色对应不同的字面表达分布</w:t>
         </w:r>
       </w:hyperlink>
     </w:p>
@@ -314,7 +328,7 @@
         <w:spacing w:after="40" w:line="288" w:lineRule="auto"/>
         <w:ind w:left="283"/>
       </w:pPr>
-      <w:hyperlink w:anchor="heading_15">
+      <w:hyperlink w:anchor="heading_16">
         <w:r>
           <w:rPr>
             <w:color w:val="32617F"/>
@@ -328,7 +342,7 @@
         <w:spacing w:after="40" w:line="288" w:lineRule="auto"/>
         <w:ind w:left="283"/>
       </w:pPr>
-      <w:hyperlink w:anchor="heading_16">
+      <w:hyperlink w:anchor="heading_17">
         <w:r>
           <w:rPr>
             <w:color w:val="32617F"/>
@@ -340,8 +354,22 @@
     <w:p>
       <w:pPr>
         <w:spacing w:after="40" w:line="288" w:lineRule="auto"/>
+        <w:ind w:left="283"/>
       </w:pPr>
-      <w:hyperlink w:anchor="heading_17">
+      <w:hyperlink w:anchor="heading_18">
+        <w:r>
+          <w:rPr>
+            <w:color w:val="32617F"/>
+          </w:rPr>
+          <w:t>5.5 鼓励与感谢存在可观测的词语顺序，回复覆盖仍需单独判断</w:t>
+        </w:r>
+      </w:hyperlink>
+    </w:p>
+    <w:p>
+      <w:pPr>
+        <w:spacing w:after="40" w:line="288" w:lineRule="auto"/>
+      </w:pPr>
+      <w:hyperlink w:anchor="heading_19">
         <w:r>
           <w:rPr>
             <w:color w:val="32617F"/>
@@ -355,7 +383,7 @@
         <w:spacing w:after="40" w:line="288" w:lineRule="auto"/>
         <w:ind w:left="283"/>
       </w:pPr>
-      <w:hyperlink w:anchor="heading_18">
+      <w:hyperlink w:anchor="heading_20">
         <w:r>
           <w:rPr>
             <w:color w:val="32617F"/>
@@ -369,7 +397,7 @@
         <w:spacing w:after="40" w:line="288" w:lineRule="auto"/>
         <w:ind w:left="283"/>
       </w:pPr>
-      <w:hyperlink w:anchor="heading_19">
+      <w:hyperlink w:anchor="heading_21">
         <w:r>
           <w:rPr>
             <w:color w:val="32617F"/>
@@ -382,7 +410,7 @@
       <w:pPr>
         <w:spacing w:after="40" w:line="288" w:lineRule="auto"/>
       </w:pPr>
-      <w:hyperlink w:anchor="heading_20">
+      <w:hyperlink w:anchor="heading_22">
         <w:r>
           <w:rPr>
             <w:color w:val="32617F"/>
@@ -396,7 +424,7 @@
         <w:spacing w:after="40" w:line="288" w:lineRule="auto"/>
         <w:ind w:left="283"/>
       </w:pPr>
-      <w:hyperlink w:anchor="heading_21">
+      <w:hyperlink w:anchor="heading_23">
         <w:r>
           <w:rPr>
             <w:color w:val="32617F"/>
@@ -410,7 +438,7 @@
         <w:spacing w:after="40" w:line="288" w:lineRule="auto"/>
         <w:ind w:left="283"/>
       </w:pPr>
-      <w:hyperlink w:anchor="heading_22">
+      <w:hyperlink w:anchor="heading_24">
         <w:r>
           <w:rPr>
             <w:color w:val="32617F"/>
@@ -423,20 +451,7 @@
       <w:pPr>
         <w:spacing w:after="40" w:line="288" w:lineRule="auto"/>
       </w:pPr>
-      <w:hyperlink w:anchor="heading_23">
-        <w:r>
-          <w:rPr>
-            <w:color w:val="32617F"/>
-          </w:rPr>
-          <w:t>附录：课程要求与成果对应</w:t>
-        </w:r>
-      </w:hyperlink>
-    </w:p>
-    <w:p>
-      <w:pPr>
-        <w:spacing w:after="40" w:line="288" w:lineRule="auto"/>
-      </w:pPr>
-      <w:hyperlink w:anchor="heading_24">
+      <w:hyperlink w:anchor="heading_25">
         <w:r>
           <w:rPr>
             <w:color w:val="32617F"/>
@@ -449,7 +464,7 @@
       <w:pPr>
         <w:spacing w:after="40" w:line="288" w:lineRule="auto"/>
       </w:pPr>
-      <w:hyperlink w:anchor="heading_25">
+      <w:hyperlink w:anchor="heading_26">
         <w:r>
           <w:rPr>
             <w:color w:val="32617F"/>
@@ -494,21 +509,321 @@
           <w:b w:val="0"/>
           <w:i w:val="0"/>
         </w:rPr>
-        <w:t>研究围绕三个问题展开。RQ1是“样本帖子、表达方式及点赞如何分布”，主要由第三章的描述统计和第四章的编码后特征分布回答；RQ2是“不同文本特征与点赞是否相关”，由第四章的词典主回归、敏感性检验、帖子主题分析及主题回归共同回答；RQ3是“采集到的评论主要表达什么、如何连接用户，互动集中在哪里”，由第五章的评论文本与互动网络分析回答。</w:t>
+        <w:t>研究围绕三个相互衔接的问题展开：先描述样本及其反馈差异，再检验帖子文本与点赞的关联，最后分析评论内容、直接回应与用户连接。</w:t>
       </w:r>
+    </w:p>
+    <w:tbl>
+      <w:tblPr>
+        <w:tblStyle w:val="LightShading-Accent1"/>
+        <w:tblW w:type="auto" w:w="0"/>
+        <w:tblLook w:firstColumn="1" w:firstRow="1" w:lastColumn="0" w:lastRow="0" w:noHBand="0" w:noVBand="1" w:val="04A0"/>
+      </w:tblPr>
+      <w:tblGrid>
+        <w:gridCol w:w="2438"/>
+        <w:gridCol w:w="2438"/>
+        <w:gridCol w:w="2438"/>
+        <w:gridCol w:w="2438"/>
+      </w:tblGrid>
+      <w:tr>
+        <w:trPr>
+          <w:cantSplit/>
+          <w:tblHeader/>
+        </w:trPr>
+        <w:tc>
+          <w:tcPr>
+            <w:tcW w:type="dxa" w:w="2438"/>
+          </w:tcPr>
+          <w:p>
+            <w:pPr>
+              <w:spacing w:line="312" w:lineRule="auto" w:after="60"/>
+            </w:pPr>
+            <w:r>
+              <w:rPr>
+                <w:sz w:val="17"/>
+              </w:rPr>
+              <w:t>编号</w:t>
+            </w:r>
+          </w:p>
+        </w:tc>
+        <w:tc>
+          <w:tcPr>
+            <w:tcW w:type="dxa" w:w="2438"/>
+          </w:tcPr>
+          <w:p>
+            <w:pPr>
+              <w:spacing w:line="312" w:lineRule="auto" w:after="60"/>
+            </w:pPr>
+            <w:r>
+              <w:rPr>
+                <w:sz w:val="17"/>
+              </w:rPr>
+              <w:t>研究问题</w:t>
+            </w:r>
+          </w:p>
+        </w:tc>
+        <w:tc>
+          <w:tcPr>
+            <w:tcW w:type="dxa" w:w="2438"/>
+          </w:tcPr>
+          <w:p>
+            <w:pPr>
+              <w:spacing w:line="312" w:lineRule="auto" w:after="60"/>
+            </w:pPr>
+            <w:r>
+              <w:rPr>
+                <w:sz w:val="17"/>
+              </w:rPr>
+              <w:t>分析对象与方法</w:t>
+            </w:r>
+          </w:p>
+        </w:tc>
+        <w:tc>
+          <w:tcPr>
+            <w:tcW w:type="dxa" w:w="2438"/>
+          </w:tcPr>
+          <w:p>
+            <w:pPr>
+              <w:spacing w:line="312" w:lineRule="auto" w:after="60"/>
+            </w:pPr>
+            <w:r>
+              <w:rPr>
+                <w:sz w:val="17"/>
+              </w:rPr>
+              <w:t>对应章节</w:t>
+            </w:r>
+          </w:p>
+        </w:tc>
+      </w:tr>
+      <w:tr>
+        <w:trPr>
+          <w:cantSplit/>
+        </w:trPr>
+        <w:tc>
+          <w:tcPr>
+            <w:tcW w:type="dxa" w:w="2438"/>
+          </w:tcPr>
+          <w:p>
+            <w:pPr>
+              <w:spacing w:line="312" w:lineRule="auto" w:after="60"/>
+            </w:pPr>
+            <w:r>
+              <w:rPr>
+                <w:sz w:val="17"/>
+              </w:rPr>
+              <w:t>RQ1</w:t>
+            </w:r>
+          </w:p>
+        </w:tc>
+        <w:tc>
+          <w:tcPr>
+            <w:tcW w:type="dxa" w:w="2438"/>
+          </w:tcPr>
+          <w:p>
+            <w:pPr>
+              <w:spacing w:line="312" w:lineRule="auto" w:after="60"/>
+            </w:pPr>
+            <w:r>
+              <w:rPr>
+                <w:sz w:val="17"/>
+              </w:rPr>
+              <w:t>样本帖子、表达方式及点赞如何分布？</w:t>
+            </w:r>
+          </w:p>
+        </w:tc>
+        <w:tc>
+          <w:tcPr>
+            <w:tcW w:type="dxa" w:w="2438"/>
+          </w:tcPr>
+          <w:p>
+            <w:pPr>
+              <w:spacing w:line="312" w:lineRule="auto" w:after="60"/>
+            </w:pPr>
+            <w:r>
+              <w:rPr>
+                <w:sz w:val="17"/>
+              </w:rPr>
+              <w:t>帖子、作者与内容形式的描述统计；编码后的文本特征分布</w:t>
+            </w:r>
+          </w:p>
+        </w:tc>
+        <w:tc>
+          <w:tcPr>
+            <w:tcW w:type="dxa" w:w="2438"/>
+          </w:tcPr>
+          <w:p>
+            <w:pPr>
+              <w:spacing w:line="312" w:lineRule="auto" w:after="60"/>
+            </w:pPr>
+            <w:r>
+              <w:rPr>
+                <w:sz w:val="17"/>
+              </w:rPr>
+              <w:t>第三章、第4.1节</w:t>
+            </w:r>
+          </w:p>
+        </w:tc>
+      </w:tr>
+      <w:tr>
+        <w:trPr>
+          <w:cantSplit/>
+        </w:trPr>
+        <w:tc>
+          <w:tcPr>
+            <w:tcW w:type="dxa" w:w="2438"/>
+          </w:tcPr>
+          <w:p>
+            <w:pPr>
+              <w:spacing w:line="312" w:lineRule="auto" w:after="60"/>
+            </w:pPr>
+            <w:r>
+              <w:rPr>
+                <w:sz w:val="17"/>
+              </w:rPr>
+              <w:t>RQ2</w:t>
+            </w:r>
+          </w:p>
+        </w:tc>
+        <w:tc>
+          <w:tcPr>
+            <w:tcW w:type="dxa" w:w="2438"/>
+          </w:tcPr>
+          <w:p>
+            <w:pPr>
+              <w:spacing w:line="312" w:lineRule="auto" w:after="60"/>
+            </w:pPr>
+            <w:r>
+              <w:rPr>
+                <w:sz w:val="17"/>
+              </w:rPr>
+              <w:t>不同文本特征与点赞是否相关？</w:t>
+            </w:r>
+          </w:p>
+        </w:tc>
+        <w:tc>
+          <w:tcPr>
+            <w:tcW w:type="dxa" w:w="2438"/>
+          </w:tcPr>
+          <w:p>
+            <w:pPr>
+              <w:spacing w:line="312" w:lineRule="auto" w:after="60"/>
+            </w:pPr>
+            <w:r>
+              <w:rPr>
+                <w:sz w:val="17"/>
+              </w:rPr>
+              <w:t>词典主回归与敏感性检验；帖子主题分析、主题回归及作者等权比较</w:t>
+            </w:r>
+          </w:p>
+        </w:tc>
+        <w:tc>
+          <w:tcPr>
+            <w:tcW w:type="dxa" w:w="2438"/>
+          </w:tcPr>
+          <w:p>
+            <w:pPr>
+              <w:spacing w:line="312" w:lineRule="auto" w:after="60"/>
+            </w:pPr>
+            <w:r>
+              <w:rPr>
+                <w:sz w:val="17"/>
+              </w:rPr>
+              <w:t>第四章</w:t>
+            </w:r>
+          </w:p>
+        </w:tc>
+      </w:tr>
+      <w:tr>
+        <w:trPr>
+          <w:cantSplit/>
+        </w:trPr>
+        <w:tc>
+          <w:tcPr>
+            <w:tcW w:type="dxa" w:w="2438"/>
+          </w:tcPr>
+          <w:p>
+            <w:pPr>
+              <w:spacing w:line="312" w:lineRule="auto" w:after="60"/>
+            </w:pPr>
+            <w:r>
+              <w:rPr>
+                <w:sz w:val="17"/>
+              </w:rPr>
+              <w:t>RQ3</w:t>
+            </w:r>
+          </w:p>
+        </w:tc>
+        <w:tc>
+          <w:tcPr>
+            <w:tcW w:type="dxa" w:w="2438"/>
+          </w:tcPr>
+          <w:p>
+            <w:pPr>
+              <w:spacing w:line="312" w:lineRule="auto" w:after="60"/>
+            </w:pPr>
+            <w:r>
+              <w:rPr>
+                <w:sz w:val="17"/>
+              </w:rPr>
+              <w:t>采集到的评论主要表达什么、如何连接用户？互动集中在哪里？</w:t>
+            </w:r>
+          </w:p>
+        </w:tc>
+        <w:tc>
+          <w:tcPr>
+            <w:tcW w:type="dxa" w:w="2438"/>
+          </w:tcPr>
+          <w:p>
+            <w:pPr>
+              <w:spacing w:line="312" w:lineRule="auto" w:after="60"/>
+            </w:pPr>
+            <w:r>
+              <w:rPr>
+                <w:sz w:val="17"/>
+              </w:rPr>
+              <w:t>评论字面表达、根评论与帖主的直接回应配对、有向加权网络及时间窗口比较</w:t>
+            </w:r>
+          </w:p>
+        </w:tc>
+        <w:tc>
+          <w:tcPr>
+            <w:tcW w:type="dxa" w:w="2438"/>
+          </w:tcPr>
+          <w:p>
+            <w:pPr>
+              <w:spacing w:line="312" w:lineRule="auto" w:after="60"/>
+            </w:pPr>
+            <w:r>
+              <w:rPr>
+                <w:sz w:val="17"/>
+              </w:rPr>
+              <w:t>第五章</w:t>
+            </w:r>
+          </w:p>
+        </w:tc>
+      </w:tr>
+    </w:tbl>
+    <w:p>
+      <w:pPr>
+        <w:spacing w:after="20"/>
+      </w:pPr>
+    </w:p>
+    <w:p>
+      <w:pPr>
+        <w:jc w:val="both"/>
+      </w:pPr>
       <w:r>
         <w:rPr>
           <w:b/>
           <w:i w:val="0"/>
         </w:rPr>
-        <w:t>帖子主题始终用于解释帖子正文的内容模式，评论文本始终用于描述回应语言</w:t>
+        <w:t>帖子主题用于描述正文内容模式，评论文本用于描述回应语言。</w:t>
       </w:r>
       <w:r>
         <w:rPr>
           <w:b w:val="0"/>
           <w:i w:val="0"/>
         </w:rPr>
-        <w:t>，两者分别服务于不同研究问题。</w:t>
+        <w:t>两者服务于不同研究问题，分别在第四、五章展开；评论的直接回应配对仍属于RQ3，不参与帖子点赞回归。</w:t>
       </w:r>
     </w:p>
     <w:p>
@@ -532,7 +847,7 @@
           <w:b w:val="0"/>
           <w:i w:val="0"/>
         </w:rPr>
-        <w:t>数据清洗、变量构建、模型估计与核查的完整过程保存在项目代码、结果文件和已执行Notebook中。正文按研究问题组织证据，图表与方法文件保留相互对应的关系，便于读者从结果追溯到具体口径。课程要求及配套交付物的对应关系列于文末附录。</w:t>
+        <w:t>数据清洗、变量构建、模型估计与核查的完整过程保存在项目代码、结果文件和已执行Notebook中。正文按研究问题组织证据，图表与方法文件保留相互对应的关系，便于读者从结果追溯到具体口径。课程要求的描述统计、非结构化数据结构化与回归、文本及网络分析、结果解释和建议分别在第三至七章展开。</w:t>
       </w:r>
     </w:p>
     <w:p>
@@ -4397,7 +4712,487 @@
           <w:b w:val="0"/>
           <w:i w:val="0"/>
         </w:rPr>
-        <w:t>运动训练和生活感悟构成该子样本中的主要内容模式，部分较小主题的文档则集中于特定作者：靠墙静蹲主题的最大作者贡献91.8%的主导文档，骑行里程主题对应比例为68.2%。这一事实提示，主题既反映内容，也可能反映特定作者持续使用的记录方式，不能直接解释为用户需求偏好。既有主题回归在相同有效正文子样本中保留词典特征与控制项，加入四个主题权重，联合检验p=0.166，四项BH校正后均未达到5%水平。三次初始化的前10关键词平均Jaccard为1.000，只说明初始化稳定，不能替代抽样稳定性或语义效度检验。主题回归还以拟合后的主题为给定输入，没有计入主题估计本身的不确定性。对业务而言，这些主题可帮助理解已见正文、整理内容类别，但不足以据此确定推荐优先级；其样本范围也不同于全样本主回归，两类有限证据不能当作同一检验的重复验证。至此，RQ2的字面表达与帖子主题两部分均已完成，下一章转向评论本身。</w:t>
+        <w:t>运动训练和生活感悟构成该子样本中的主要内容模式，部分较小主题的文档则集中于特定作者：靠墙静蹲主题的最大作者贡献91.8%的主导文档，骑行里程主题对应比例为68.2%。这一事实提示，主题既反映内容，也可能反映特定作者持续使用的记录方式，不能直接解释为用户需求偏好。既有主题回归在相同有效正文子样本中保留词典特征与控制项，加入四个主题权重，联合检验p=0.166，四项BH校正后均未达到5%水平。三次初始化的前10关键词平均Jaccard为1.000，只说明初始化稳定，不能替代抽样稳定性或语义效度检验。主题回归还以拟合后的主题为给定输入，没有计入主题估计本身的不确定性。对业务而言，这些主题可帮助理解已见正文、整理内容类别，但不足以据此确定推荐优先级；其样本范围也不同于全样本主回归，两类有限证据不能当作同一检验的重复验证。下一节进一步考察，帖子数量不同的作者是否影响了主题分布的整体判断。</w:t>
+      </w:r>
+    </w:p>
+    <w:p>
+      <w:pPr>
+        <w:pStyle w:val="Heading2"/>
+      </w:pPr>
+      <w:r>
+        <w:t>4.5 作者等权后主要内容格局保持稳定，部分小主题占比收缩</w:t>
+      </w:r>
+      <w:bookmarkStart w:id="12" w:name="heading_12"/>
+      <w:bookmarkEnd w:id="12"/>
+    </w:p>
+    <w:tbl>
+      <w:tblPr>
+        <w:tblStyle w:val="LightShading-Accent1"/>
+        <w:tblW w:type="auto" w:w="0"/>
+        <w:tblLook w:firstColumn="1" w:firstRow="1" w:lastColumn="0" w:lastRow="0" w:noHBand="0" w:noVBand="1" w:val="04A0"/>
+      </w:tblPr>
+      <w:tblGrid>
+        <w:gridCol w:w="2438"/>
+        <w:gridCol w:w="2438"/>
+        <w:gridCol w:w="2438"/>
+        <w:gridCol w:w="2438"/>
+      </w:tblGrid>
+      <w:tr>
+        <w:trPr>
+          <w:cantSplit/>
+          <w:tblHeader/>
+        </w:trPr>
+        <w:tc>
+          <w:tcPr>
+            <w:tcW w:type="dxa" w:w="2438"/>
+          </w:tcPr>
+          <w:p>
+            <w:pPr>
+              <w:spacing w:line="312" w:lineRule="auto" w:after="60"/>
+            </w:pPr>
+            <w:r>
+              <w:rPr>
+                <w:sz w:val="17"/>
+              </w:rPr>
+              <w:t>主导主题</w:t>
+            </w:r>
+          </w:p>
+        </w:tc>
+        <w:tc>
+          <w:tcPr>
+            <w:tcW w:type="dxa" w:w="2438"/>
+          </w:tcPr>
+          <w:p>
+            <w:pPr>
+              <w:spacing w:line="312" w:lineRule="auto" w:after="60"/>
+            </w:pPr>
+            <w:r>
+              <w:rPr>
+                <w:sz w:val="17"/>
+              </w:rPr>
+              <w:t>帖子等权占比</w:t>
+            </w:r>
+          </w:p>
+        </w:tc>
+        <w:tc>
+          <w:tcPr>
+            <w:tcW w:type="dxa" w:w="2438"/>
+          </w:tcPr>
+          <w:p>
+            <w:pPr>
+              <w:spacing w:line="312" w:lineRule="auto" w:after="60"/>
+            </w:pPr>
+            <w:r>
+              <w:rPr>
+                <w:sz w:val="17"/>
+              </w:rPr>
+              <w:t>作者等权占比</w:t>
+            </w:r>
+          </w:p>
+        </w:tc>
+        <w:tc>
+          <w:tcPr>
+            <w:tcW w:type="dxa" w:w="2438"/>
+          </w:tcPr>
+          <w:p>
+            <w:pPr>
+              <w:spacing w:line="312" w:lineRule="auto" w:after="60"/>
+            </w:pPr>
+            <w:r>
+              <w:rPr>
+                <w:sz w:val="17"/>
+              </w:rPr>
+              <w:t>占比差（百分点）</w:t>
+            </w:r>
+          </w:p>
+        </w:tc>
+      </w:tr>
+      <w:tr>
+        <w:trPr>
+          <w:cantSplit/>
+        </w:trPr>
+        <w:tc>
+          <w:tcPr>
+            <w:tcW w:type="dxa" w:w="2438"/>
+          </w:tcPr>
+          <w:p>
+            <w:pPr>
+              <w:spacing w:line="312" w:lineRule="auto" w:after="60"/>
+            </w:pPr>
+            <w:r>
+              <w:rPr>
+                <w:sz w:val="17"/>
+              </w:rPr>
+              <w:t>靠墙静蹲记录</w:t>
+            </w:r>
+          </w:p>
+        </w:tc>
+        <w:tc>
+          <w:tcPr>
+            <w:tcW w:type="dxa" w:w="2438"/>
+          </w:tcPr>
+          <w:p>
+            <w:pPr>
+              <w:spacing w:line="312" w:lineRule="auto" w:after="60"/>
+            </w:pPr>
+            <w:r>
+              <w:rPr>
+                <w:sz w:val="17"/>
+              </w:rPr>
+              <w:t>3.4%</w:t>
+            </w:r>
+          </w:p>
+        </w:tc>
+        <w:tc>
+          <w:tcPr>
+            <w:tcW w:type="dxa" w:w="2438"/>
+          </w:tcPr>
+          <w:p>
+            <w:pPr>
+              <w:spacing w:line="312" w:lineRule="auto" w:after="60"/>
+            </w:pPr>
+            <w:r>
+              <w:rPr>
+                <w:sz w:val="17"/>
+              </w:rPr>
+              <w:t>0.6%</w:t>
+            </w:r>
+          </w:p>
+        </w:tc>
+        <w:tc>
+          <w:tcPr>
+            <w:tcW w:type="dxa" w:w="2438"/>
+          </w:tcPr>
+          <w:p>
+            <w:pPr>
+              <w:spacing w:line="312" w:lineRule="auto" w:after="60"/>
+            </w:pPr>
+            <w:r>
+              <w:rPr>
+                <w:sz w:val="17"/>
+              </w:rPr>
+              <w:t>-2.82</w:t>
+            </w:r>
+          </w:p>
+        </w:tc>
+      </w:tr>
+      <w:tr>
+        <w:trPr>
+          <w:cantSplit/>
+        </w:trPr>
+        <w:tc>
+          <w:tcPr>
+            <w:tcW w:type="dxa" w:w="2438"/>
+          </w:tcPr>
+          <w:p>
+            <w:pPr>
+              <w:spacing w:line="312" w:lineRule="auto" w:after="60"/>
+            </w:pPr>
+            <w:r>
+              <w:rPr>
+                <w:sz w:val="17"/>
+              </w:rPr>
+              <w:t>骑行里程记录</w:t>
+            </w:r>
+          </w:p>
+        </w:tc>
+        <w:tc>
+          <w:tcPr>
+            <w:tcW w:type="dxa" w:w="2438"/>
+          </w:tcPr>
+          <w:p>
+            <w:pPr>
+              <w:spacing w:line="312" w:lineRule="auto" w:after="60"/>
+            </w:pPr>
+            <w:r>
+              <w:rPr>
+                <w:sz w:val="17"/>
+              </w:rPr>
+              <w:t>3.4%</w:t>
+            </w:r>
+          </w:p>
+        </w:tc>
+        <w:tc>
+          <w:tcPr>
+            <w:tcW w:type="dxa" w:w="2438"/>
+          </w:tcPr>
+          <w:p>
+            <w:pPr>
+              <w:spacing w:line="312" w:lineRule="auto" w:after="60"/>
+            </w:pPr>
+            <w:r>
+              <w:rPr>
+                <w:sz w:val="17"/>
+              </w:rPr>
+              <w:t>2.9%</w:t>
+            </w:r>
+          </w:p>
+        </w:tc>
+        <w:tc>
+          <w:tcPr>
+            <w:tcW w:type="dxa" w:w="2438"/>
+          </w:tcPr>
+          <w:p>
+            <w:pPr>
+              <w:spacing w:line="312" w:lineRule="auto" w:after="60"/>
+            </w:pPr>
+            <w:r>
+              <w:rPr>
+                <w:sz w:val="17"/>
+              </w:rPr>
+              <w:t>-0.53</w:t>
+            </w:r>
+          </w:p>
+        </w:tc>
+      </w:tr>
+      <w:tr>
+        <w:trPr>
+          <w:cantSplit/>
+        </w:trPr>
+        <w:tc>
+          <w:tcPr>
+            <w:tcW w:type="dxa" w:w="2438"/>
+          </w:tcPr>
+          <w:p>
+            <w:pPr>
+              <w:spacing w:line="312" w:lineRule="auto" w:after="60"/>
+            </w:pPr>
+            <w:r>
+              <w:rPr>
+                <w:sz w:val="17"/>
+              </w:rPr>
+              <w:t>运动与训练交流</w:t>
+            </w:r>
+          </w:p>
+        </w:tc>
+        <w:tc>
+          <w:tcPr>
+            <w:tcW w:type="dxa" w:w="2438"/>
+          </w:tcPr>
+          <w:p>
+            <w:pPr>
+              <w:spacing w:line="312" w:lineRule="auto" w:after="60"/>
+            </w:pPr>
+            <w:r>
+              <w:rPr>
+                <w:sz w:val="17"/>
+              </w:rPr>
+              <w:t>52.7%</w:t>
+            </w:r>
+          </w:p>
+        </w:tc>
+        <w:tc>
+          <w:tcPr>
+            <w:tcW w:type="dxa" w:w="2438"/>
+          </w:tcPr>
+          <w:p>
+            <w:pPr>
+              <w:spacing w:line="312" w:lineRule="auto" w:after="60"/>
+            </w:pPr>
+            <w:r>
+              <w:rPr>
+                <w:sz w:val="17"/>
+              </w:rPr>
+              <w:t>52.6%</w:t>
+            </w:r>
+          </w:p>
+        </w:tc>
+        <w:tc>
+          <w:tcPr>
+            <w:tcW w:type="dxa" w:w="2438"/>
+          </w:tcPr>
+          <w:p>
+            <w:pPr>
+              <w:spacing w:line="312" w:lineRule="auto" w:after="60"/>
+            </w:pPr>
+            <w:r>
+              <w:rPr>
+                <w:sz w:val="17"/>
+              </w:rPr>
+              <w:t>-0.08</w:t>
+            </w:r>
+          </w:p>
+        </w:tc>
+      </w:tr>
+      <w:tr>
+        <w:trPr>
+          <w:cantSplit/>
+        </w:trPr>
+        <w:tc>
+          <w:tcPr>
+            <w:tcW w:type="dxa" w:w="2438"/>
+          </w:tcPr>
+          <w:p>
+            <w:pPr>
+              <w:spacing w:line="312" w:lineRule="auto" w:after="60"/>
+            </w:pPr>
+            <w:r>
+              <w:rPr>
+                <w:sz w:val="17"/>
+              </w:rPr>
+              <w:t>跑步与训练打卡</w:t>
+            </w:r>
+          </w:p>
+        </w:tc>
+        <w:tc>
+          <w:tcPr>
+            <w:tcW w:type="dxa" w:w="2438"/>
+          </w:tcPr>
+          <w:p>
+            <w:pPr>
+              <w:spacing w:line="312" w:lineRule="auto" w:after="60"/>
+            </w:pPr>
+            <w:r>
+              <w:rPr>
+                <w:sz w:val="17"/>
+              </w:rPr>
+              <w:t>4.6%</w:t>
+            </w:r>
+          </w:p>
+        </w:tc>
+        <w:tc>
+          <w:tcPr>
+            <w:tcW w:type="dxa" w:w="2438"/>
+          </w:tcPr>
+          <w:p>
+            <w:pPr>
+              <w:spacing w:line="312" w:lineRule="auto" w:after="60"/>
+            </w:pPr>
+            <w:r>
+              <w:rPr>
+                <w:sz w:val="17"/>
+              </w:rPr>
+              <w:t>5.7%</w:t>
+            </w:r>
+          </w:p>
+        </w:tc>
+        <w:tc>
+          <w:tcPr>
+            <w:tcW w:type="dxa" w:w="2438"/>
+          </w:tcPr>
+          <w:p>
+            <w:pPr>
+              <w:spacing w:line="312" w:lineRule="auto" w:after="60"/>
+            </w:pPr>
+            <w:r>
+              <w:rPr>
+                <w:sz w:val="17"/>
+              </w:rPr>
+              <w:t>+1.10</w:t>
+            </w:r>
+          </w:p>
+        </w:tc>
+      </w:tr>
+      <w:tr>
+        <w:trPr>
+          <w:cantSplit/>
+        </w:trPr>
+        <w:tc>
+          <w:tcPr>
+            <w:tcW w:type="dxa" w:w="2438"/>
+          </w:tcPr>
+          <w:p>
+            <w:pPr>
+              <w:spacing w:line="312" w:lineRule="auto" w:after="60"/>
+            </w:pPr>
+            <w:r>
+              <w:rPr>
+                <w:sz w:val="17"/>
+              </w:rPr>
+              <w:t>生活感悟与问候</w:t>
+            </w:r>
+          </w:p>
+        </w:tc>
+        <w:tc>
+          <w:tcPr>
+            <w:tcW w:type="dxa" w:w="2438"/>
+          </w:tcPr>
+          <w:p>
+            <w:pPr>
+              <w:spacing w:line="312" w:lineRule="auto" w:after="60"/>
+            </w:pPr>
+            <w:r>
+              <w:rPr>
+                <w:sz w:val="17"/>
+              </w:rPr>
+              <w:t>35.8%</w:t>
+            </w:r>
+          </w:p>
+        </w:tc>
+        <w:tc>
+          <w:tcPr>
+            <w:tcW w:type="dxa" w:w="2438"/>
+          </w:tcPr>
+          <w:p>
+            <w:pPr>
+              <w:spacing w:line="312" w:lineRule="auto" w:after="60"/>
+            </w:pPr>
+            <w:r>
+              <w:rPr>
+                <w:sz w:val="17"/>
+              </w:rPr>
+              <w:t>38.2%</w:t>
+            </w:r>
+          </w:p>
+        </w:tc>
+        <w:tc>
+          <w:tcPr>
+            <w:tcW w:type="dxa" w:w="2438"/>
+          </w:tcPr>
+          <w:p>
+            <w:pPr>
+              <w:spacing w:line="312" w:lineRule="auto" w:after="60"/>
+            </w:pPr>
+            <w:r>
+              <w:rPr>
+                <w:sz w:val="17"/>
+              </w:rPr>
+              <w:t>+2.33</w:t>
+            </w:r>
+          </w:p>
+        </w:tc>
+      </w:tr>
+    </w:tbl>
+    <w:p>
+      <w:pPr>
+        <w:spacing w:after="20"/>
+      </w:pPr>
+    </w:p>
+    <w:p>
+      <w:pPr>
+        <w:jc w:val="both"/>
+      </w:pPr>
+      <w:r>
+        <w:rPr>
+          <w:b w:val="0"/>
+          <w:i w:val="0"/>
+          <w:sz w:val="18"/>
+        </w:rPr>
+        <w:t>来源：[10]。范围仍为既有2,470帖、86位作者；占比差使用未舍入数值计算，正值表示作者等权后的占比更高。</w:t>
+      </w:r>
+    </w:p>
+    <w:p>
+      <w:pPr>
+        <w:jc w:val="both"/>
+      </w:pPr>
+      <w:r>
+        <w:rPr>
+          <w:b w:val="0"/>
+          <w:i w:val="0"/>
+        </w:rPr>
+        <w:t>原主题图按帖子计量，高产作者对分布的贡献自然更大。补充分析保持每条正文的主题归类不变，先计算每位作者内部的主导主题占比，再对86位作者等权平均。两种权重回答不同问题：帖子等权反映这批正文的内容构成，作者等权反映在每位作者贡献相同总权重时的平均内容构成。它们都限定于有效正文样本，不代表全部100位样本作者，更不代表平台总体。</w:t>
+      </w:r>
+    </w:p>
+    <w:p>
+      <w:pPr>
+        <w:jc w:val="both"/>
+      </w:pPr>
+      <w:r>
+        <w:rPr>
+          <w:b w:val="0"/>
+          <w:i w:val="0"/>
+        </w:rPr>
+        <w:t>比较结果表明，运动与训练交流在作者等权后仍占一半以上，生活感悟与问候的占比略有增加，主要内容格局没有因高产作者权重的降低而改变。靠墙静蹲记录的占比则明显缩小，与前一节发现的作者集中相互印证，说明这个小主题的帖子占比更容易受到特定作者反复记录的影响。这里能够确认的是权重改变后的分布差异，不能把它解释为某类内容需求下降，也不能认定作者等权比帖子等权更准确；发帖很少的作者在等权后获得相同总权重，同样需要结合分析目的理解。对于内容分类，较稳妥的做法是将跨作者较稳定的主要模式用于概括样本，同时把作者集中较高的小主题保留为特定记录方式，避免把高频模板直接当作普遍需求。这项比较扩展了主题描述的解释范围，没有增加新的点赞回归证据。至此，帖子文本的结构化、关联检验与主题构成分析共同完成了RQ2，后续章节转向评论内容及回应关系。</w:t>
       </w:r>
     </w:p>
     <w:p>
@@ -4412,8 +5207,8 @@
       <w:r>
         <w:t>5. 评论文本与互动网络分析</w:t>
       </w:r>
-      <w:bookmarkStart w:id="12" w:name="heading_12"/>
-      <w:bookmarkEnd w:id="12"/>
+      <w:bookmarkStart w:id="13" w:name="heading_13"/>
+      <w:bookmarkEnd w:id="13"/>
     </w:p>
     <w:p>
       <w:pPr>
@@ -4422,8 +5217,8 @@
       <w:r>
         <w:t>5.1 评论以短表达为主，高频用语的用户覆盖存在差异</w:t>
       </w:r>
-      <w:bookmarkStart w:id="13" w:name="heading_13"/>
-      <w:bookmarkEnd w:id="13"/>
+      <w:bookmarkStart w:id="14" w:name="heading_14"/>
+      <w:bookmarkEnd w:id="14"/>
     </w:p>
     <w:p>
       <w:pPr>
@@ -4850,10 +5645,10 @@
         <w:pStyle w:val="Heading2"/>
       </w:pPr>
       <w:r>
-        <w:t>5.2 发言角色对应不同表达，但尚未验证固定回应链条</w:t>
+        <w:t>5.2 发言角色对应不同的字面表达分布</w:t>
       </w:r>
-      <w:bookmarkStart w:id="14" w:name="heading_14"/>
-      <w:bookmarkEnd w:id="14"/>
+      <w:bookmarkStart w:id="15" w:name="heading_15"/>
+      <w:bookmarkEnd w:id="15"/>
     </w:p>
     <w:p>
       <w:pPr>
@@ -5381,7 +6176,7 @@
           <w:b w:val="0"/>
           <w:i w:val="0"/>
         </w:rPr>
-        <w:t>已经确认的事实是，在所选规则下，其他用户发言更常命中鼓励或赞许词，帖主发言更常命中感谢词。一种与结果相容的解释是，评论双方在交流中承担了不同的语言角色：参与者提供赞许，帖主表达回应或感谢。但本研究没有逐线程检验词语的先后对应，也没有使用独立人工标注判断表达是否真诚、是否回应了具体内容，因此尚不能将这一解释写成已经验证的“鼓励—感谢”链条。未命中也不等于没有相应语义，问号不能直接当作真实提问。对业务的实际启示是，衡量互动内容时可先区分发言角色，避免将总体感谢词频或鼓励词频当作所有参与者的共同倾向；若要设计回应模板或支持提示，应先确认具体语境与接收体验。现有结果提供了值得进一步观察的角色差异，没有估计任何提示方案对交流质量或留存的效果。</w:t>
+        <w:t>已经确认的事实是，在所选规则下，其他用户发言更常命中鼓励或赞许词，帖主发言更常命中感谢词。一种与结果相容的解释是，评论双方在交流中承担了不同的语言角色：参与者提供赞许，帖主表达回应或感谢。但这组角色统计本身没有验证词语的先后对应，也没有使用独立人工标注判断具体语义。第5.5节进一步通过评论ID、用户指向与时间匹配，识别可观测的词语顺序；即使存在这种顺序，也不能直接证明真实动机或普遍的社会支持机制。未命中不等于没有相应语义，问号也不能直接当作真实提问。对业务的实际启示是，衡量互动内容时可先区分发言角色，避免将总体感谢词频或鼓励词频当作所有参与者的共同倾向；若要设计回应模板或支持提示，应先确认具体语境与接收体验。现有结果提供了值得进一步观察的角色差异，没有估计任何提示方案对交流质量或留存的效果。</w:t>
       </w:r>
     </w:p>
     <w:p>
@@ -5391,8 +6186,8 @@
       <w:r>
         <w:t>5.3 多数节点处于同一弱连通分量，接收事件较为集中</w:t>
       </w:r>
-      <w:bookmarkStart w:id="15" w:name="heading_15"/>
-      <w:bookmarkEnd w:id="15"/>
+      <w:bookmarkStart w:id="16" w:name="heading_16"/>
+      <w:bookmarkEnd w:id="16"/>
     </w:p>
     <w:p>
       <w:pPr>
@@ -5974,8 +6769,8 @@
       <w:r>
         <w:t>5.4 帖主承担多数明确回复，时间窗口会改变网络描述</w:t>
       </w:r>
-      <w:bookmarkStart w:id="16" w:name="heading_16"/>
-      <w:bookmarkEnd w:id="16"/>
+      <w:bookmarkStart w:id="17" w:name="heading_17"/>
+      <w:bookmarkEnd w:id="17"/>
     </w:p>
     <w:p>
       <w:pPr>
@@ -6386,6 +7181,328 @@
       </w:r>
     </w:p>
     <w:p>
+      <w:pPr>
+        <w:pStyle w:val="Heading2"/>
+      </w:pPr>
+      <w:r>
+        <w:t>5.5 鼓励与感谢存在可观测的词语顺序，回复覆盖仍需单独判断</w:t>
+      </w:r>
+      <w:bookmarkStart w:id="18" w:name="heading_18"/>
+      <w:bookmarkEnd w:id="18"/>
+    </w:p>
+    <w:tbl>
+      <w:tblPr>
+        <w:tblStyle w:val="LightShading-Accent1"/>
+        <w:tblW w:type="auto" w:w="0"/>
+        <w:tblLook w:firstColumn="1" w:firstRow="1" w:lastColumn="0" w:lastRow="0" w:noHBand="0" w:noVBand="1" w:val="04A0"/>
+      </w:tblPr>
+      <w:tblGrid>
+        <w:gridCol w:w="1950"/>
+        <w:gridCol w:w="1950"/>
+        <w:gridCol w:w="1950"/>
+        <w:gridCol w:w="1950"/>
+        <w:gridCol w:w="1950"/>
+      </w:tblGrid>
+      <w:tr>
+        <w:trPr>
+          <w:cantSplit/>
+          <w:tblHeader/>
+        </w:trPr>
+        <w:tc>
+          <w:tcPr>
+            <w:tcW w:type="dxa" w:w="1950"/>
+          </w:tcPr>
+          <w:p>
+            <w:pPr>
+              <w:spacing w:line="312" w:lineRule="auto" w:after="60"/>
+            </w:pPr>
+            <w:r>
+              <w:rPr>
+                <w:sz w:val="17"/>
+              </w:rPr>
+              <w:t>外来根评论组别</w:t>
+            </w:r>
+          </w:p>
+        </w:tc>
+        <w:tc>
+          <w:tcPr>
+            <w:tcW w:type="dxa" w:w="1950"/>
+          </w:tcPr>
+          <w:p>
+            <w:pPr>
+              <w:spacing w:line="312" w:lineRule="auto" w:after="60"/>
+            </w:pPr>
+            <w:r>
+              <w:rPr>
+                <w:sz w:val="17"/>
+              </w:rPr>
+              <w:t>根评论数</w:t>
+            </w:r>
+          </w:p>
+        </w:tc>
+        <w:tc>
+          <w:tcPr>
+            <w:tcW w:type="dxa" w:w="1950"/>
+          </w:tcPr>
+          <w:p>
+            <w:pPr>
+              <w:spacing w:line="312" w:lineRule="auto" w:after="60"/>
+            </w:pPr>
+            <w:r>
+              <w:rPr>
+                <w:sz w:val="17"/>
+              </w:rPr>
+              <w:t>涉及帖主数</w:t>
+            </w:r>
+          </w:p>
+        </w:tc>
+        <w:tc>
+          <w:tcPr>
+            <w:tcW w:type="dxa" w:w="1950"/>
+          </w:tcPr>
+          <w:p>
+            <w:pPr>
+              <w:spacing w:line="312" w:lineRule="auto" w:after="60"/>
+            </w:pPr>
+            <w:r>
+              <w:rPr>
+                <w:sz w:val="17"/>
+              </w:rPr>
+              <w:t>观察到7天内直接回复</w:t>
+            </w:r>
+          </w:p>
+        </w:tc>
+        <w:tc>
+          <w:tcPr>
+            <w:tcW w:type="dxa" w:w="1950"/>
+          </w:tcPr>
+          <w:p>
+            <w:pPr>
+              <w:spacing w:line="312" w:lineRule="auto" w:after="60"/>
+            </w:pPr>
+            <w:r>
+              <w:rPr>
+                <w:sz w:val="17"/>
+              </w:rPr>
+              <w:t>最早观测回复命中感谢词</w:t>
+            </w:r>
+          </w:p>
+        </w:tc>
+      </w:tr>
+      <w:tr>
+        <w:trPr>
+          <w:cantSplit/>
+        </w:trPr>
+        <w:tc>
+          <w:tcPr>
+            <w:tcW w:type="dxa" w:w="1950"/>
+          </w:tcPr>
+          <w:p>
+            <w:pPr>
+              <w:spacing w:line="312" w:lineRule="auto" w:after="60"/>
+            </w:pPr>
+            <w:r>
+              <w:rPr>
+                <w:sz w:val="17"/>
+              </w:rPr>
+              <w:t>命中鼓励或赞许词</w:t>
+            </w:r>
+          </w:p>
+        </w:tc>
+        <w:tc>
+          <w:tcPr>
+            <w:tcW w:type="dxa" w:w="1950"/>
+          </w:tcPr>
+          <w:p>
+            <w:pPr>
+              <w:spacing w:line="312" w:lineRule="auto" w:after="60"/>
+            </w:pPr>
+            <w:r>
+              <w:rPr>
+                <w:sz w:val="17"/>
+              </w:rPr>
+              <w:t>1,180</w:t>
+            </w:r>
+          </w:p>
+        </w:tc>
+        <w:tc>
+          <w:tcPr>
+            <w:tcW w:type="dxa" w:w="1950"/>
+          </w:tcPr>
+          <w:p>
+            <w:pPr>
+              <w:spacing w:line="312" w:lineRule="auto" w:after="60"/>
+            </w:pPr>
+            <w:r>
+              <w:rPr>
+                <w:sz w:val="17"/>
+              </w:rPr>
+              <w:t>54</w:t>
+            </w:r>
+          </w:p>
+        </w:tc>
+        <w:tc>
+          <w:tcPr>
+            <w:tcW w:type="dxa" w:w="1950"/>
+          </w:tcPr>
+          <w:p>
+            <w:pPr>
+              <w:spacing w:line="312" w:lineRule="auto" w:after="60"/>
+            </w:pPr>
+            <w:r>
+              <w:rPr>
+                <w:sz w:val="17"/>
+              </w:rPr>
+              <w:t>513（43.5%）</w:t>
+            </w:r>
+          </w:p>
+        </w:tc>
+        <w:tc>
+          <w:tcPr>
+            <w:tcW w:type="dxa" w:w="1950"/>
+          </w:tcPr>
+          <w:p>
+            <w:pPr>
+              <w:spacing w:line="312" w:lineRule="auto" w:after="60"/>
+            </w:pPr>
+            <w:r>
+              <w:rPr>
+                <w:sz w:val="17"/>
+              </w:rPr>
+              <w:t>137（26.7%）</w:t>
+            </w:r>
+          </w:p>
+        </w:tc>
+      </w:tr>
+      <w:tr>
+        <w:trPr>
+          <w:cantSplit/>
+        </w:trPr>
+        <w:tc>
+          <w:tcPr>
+            <w:tcW w:type="dxa" w:w="1950"/>
+          </w:tcPr>
+          <w:p>
+            <w:pPr>
+              <w:spacing w:line="312" w:lineRule="auto" w:after="60"/>
+            </w:pPr>
+            <w:r>
+              <w:rPr>
+                <w:sz w:val="17"/>
+              </w:rPr>
+              <w:t>未命中鼓励或赞许词</w:t>
+            </w:r>
+          </w:p>
+        </w:tc>
+        <w:tc>
+          <w:tcPr>
+            <w:tcW w:type="dxa" w:w="1950"/>
+          </w:tcPr>
+          <w:p>
+            <w:pPr>
+              <w:spacing w:line="312" w:lineRule="auto" w:after="60"/>
+            </w:pPr>
+            <w:r>
+              <w:rPr>
+                <w:sz w:val="17"/>
+              </w:rPr>
+              <w:t>5,429</w:t>
+            </w:r>
+          </w:p>
+        </w:tc>
+        <w:tc>
+          <w:tcPr>
+            <w:tcW w:type="dxa" w:w="1950"/>
+          </w:tcPr>
+          <w:p>
+            <w:pPr>
+              <w:spacing w:line="312" w:lineRule="auto" w:after="60"/>
+            </w:pPr>
+            <w:r>
+              <w:rPr>
+                <w:sz w:val="17"/>
+              </w:rPr>
+              <w:t>77</w:t>
+            </w:r>
+          </w:p>
+        </w:tc>
+        <w:tc>
+          <w:tcPr>
+            <w:tcW w:type="dxa" w:w="1950"/>
+          </w:tcPr>
+          <w:p>
+            <w:pPr>
+              <w:spacing w:line="312" w:lineRule="auto" w:after="60"/>
+            </w:pPr>
+            <w:r>
+              <w:rPr>
+                <w:sz w:val="17"/>
+              </w:rPr>
+              <w:t>3,055（56.3%）</w:t>
+            </w:r>
+          </w:p>
+        </w:tc>
+        <w:tc>
+          <w:tcPr>
+            <w:tcW w:type="dxa" w:w="1950"/>
+          </w:tcPr>
+          <w:p>
+            <w:pPr>
+              <w:spacing w:line="312" w:lineRule="auto" w:after="60"/>
+            </w:pPr>
+            <w:r>
+              <w:rPr>
+                <w:sz w:val="17"/>
+              </w:rPr>
+              <w:t>195（6.4%）</w:t>
+            </w:r>
+          </w:p>
+        </w:tc>
+      </w:tr>
+    </w:tbl>
+    <w:p>
+      <w:pPr>
+        <w:spacing w:after="20"/>
+      </w:pPr>
+    </w:p>
+    <w:p>
+      <w:pPr>
+        <w:jc w:val="both"/>
+      </w:pPr>
+      <w:r>
+        <w:rPr>
+          <w:b w:val="0"/>
+          <w:i w:val="0"/>
+          <w:sz w:val="18"/>
+        </w:rPr>
+        <w:t>来源：[10]。直接回复占比以各组全部根评论为分母；感谢词命中率只以各组观察到直接回复的根评论为分母，同一帖主可出现在两组。时间窗从根评论发出起算168小时，与第5.4节从发帖起算的网络窗口不同。</w:t>
+      </w:r>
+    </w:p>
+    <w:p>
+      <w:pPr>
+        <w:jc w:val="both"/>
+      </w:pPr>
+      <w:r>
+        <w:rPr>
+          <w:b w:val="0"/>
+          <w:i w:val="0"/>
+        </w:rPr>
+        <w:t>为将角色分布推进到具体回应，本节对6,609条外来根评论逐条匹配帖主的直接回复。回复必须通过reply字段直接指向根评论ID，replyUserId必须为根评论作者，所属帖子与parentId也须一致；时间不早于根评论且间隔不超过168小时。每条根评论只保留最早观测到的直接回复时点，检查该时点是否命中既有感谢词规则。合计3,568条根评论具有符合条件的观测回复。该口径比第5.4节统计的线程内帖主参与更严格，不把同一线程中回应其他评论的行为混入。时间截点仅限制纳入记录，不保证每条根评论均有完整七天采集。</w:t>
+      </w:r>
+    </w:p>
+    <w:p>
+      <w:pPr>
+        <w:jc w:val="both"/>
+      </w:pPr>
+      <w:r>
+        <w:rPr>
+          <w:b w:val="0"/>
+          <w:i w:val="0"/>
+        </w:rPr>
+        <w:t>结果呈现出两个需要同时理解的侧面。在已观察到直接回复的根评论中，鼓励或赞许词命中组的最早回复更常出现感谢词，说明部分跨评论的字面顺序可以被直接核对；但这一组观察到直接回复的比例低于未命中组，不能据此概括为“鼓励更容易获得回应”。若改以各组全部根评论为分母，最早回复含感谢词的观测占比分别为11.6%和3.6%，同样只是所选记录中的顺序共现。两组涉及的帖主范围不同，内容情境、重复发言和采集覆盖也可能不同，且感谢率以已经观察到回复为条件，不能将组间差异归因于鼓励用语本身。最早观测记录未必是实际首次回复，未见匹配也不等于实际未回应。对于互动评价，这一补充支持把回应覆盖与回应内容分别报告：感谢词较多可以描述一种语言承接，却不能独立代表更多用户得到回复或更高的交流质量。词语顺序的核对缩小了原先仅凭角色分布作解释的距离，但完整语义、用户体验和业务效果仍需要进一步验证。</w:t>
+      </w:r>
+    </w:p>
+    <w:p>
       <w:r>
         <w:br w:type="page"/>
       </w:r>
@@ -6397,8 +7514,8 @@
       <w:r>
         <w:t>6. 结果与解释</w:t>
       </w:r>
-      <w:bookmarkStart w:id="17" w:name="heading_17"/>
-      <w:bookmarkEnd w:id="17"/>
+      <w:bookmarkStart w:id="19" w:name="heading_19"/>
+      <w:bookmarkEnd w:id="19"/>
     </w:p>
     <w:p>
       <w:pPr>
@@ -6407,8 +7524,8 @@
       <w:r>
         <w:t>6.1 两类证据分别刻画内容反馈与回应关系</w:t>
       </w:r>
-      <w:bookmarkStart w:id="18" w:name="heading_18"/>
-      <w:bookmarkEnd w:id="18"/>
+      <w:bookmarkStart w:id="20" w:name="heading_20"/>
+      <w:bookmarkEnd w:id="20"/>
     </w:p>
     <w:tbl>
       <w:tblPr>
@@ -6613,7 +7730,7 @@
               <w:rPr>
                 <w:sz w:val="17"/>
               </w:rPr>
-              <w:t>字面表达具有角色差异，互动围绕帖主且接收集中</w:t>
+              <w:t>字面表达具有角色差异，部分直接回复呈现鼓励与感谢的词语顺序；互动围绕帖主且接收集中</w:t>
             </w:r>
           </w:p>
         </w:tc>
@@ -6629,7 +7746,7 @@
               <w:rPr>
                 <w:sz w:val="17"/>
               </w:rPr>
-              <w:t>已验证鼓励—感谢链条，或已改善交流质量与留存</w:t>
+              <w:t>已识别社会支持机制，或已改善交流质量与留存</w:t>
             </w:r>
           </w:p>
         </w:tc>
@@ -6650,7 +7767,7 @@
           <w:i w:val="0"/>
           <w:sz w:val="18"/>
         </w:rPr>
-        <w:t>来源：[2]—[6]的综合解释；右栏为证据边界，不是新增检验结论。</w:t>
+        <w:t>来源：[2]—[6]及[10]的综合解释；右栏为证据边界，不是新增检验结论。</w:t>
       </w:r>
     </w:p>
     <w:p>
@@ -6662,7 +7779,7 @@
           <w:b w:val="0"/>
           <w:i w:val="0"/>
         </w:rPr>
-        <w:t>从RQ1到RQ2，研究的关键进展是比较条件的变化。描述统计呈现样本中已记录的差异，回归则在可观测条件和作者内比较下检验其中一部分文本特征。两者结果不同，提醒内容评价不能停留在高赞样本的表面共性。主题分析扩大了对正文内容模式的描述范围，也保留了有效正文筛选、作者模板和测量不确定性的限制。这些分析尚未提供可直接用于提升点赞的表达规则，但进一步明确了内容评价能够依赖的证据范围。</w:t>
+        <w:t>从RQ1到RQ2，研究的关键进展是比较条件的变化。描述统计呈现样本中已记录的差异，回归则在可观测条件和作者内比较下检验其中一部分文本特征。两者结果不同，提醒内容评价不能停留在高赞样本的表面共性。主题分析扩大了对正文内容模式的描述范围；作者等权比较进一步显示，主要内容格局相对稳定，部分小主题更受作者构成影响。不过，分布对权重较稳定，并不意味着与点赞的关联已经明确。有效正文筛选、作者模板和测量不确定性的限制仍需保留。这些分析尚未提供可直接用于提升点赞的表达规则，但进一步明确了内容评价能够依赖的证据范围。</w:t>
       </w:r>
     </w:p>
     <w:p>
@@ -6674,7 +7791,7 @@
           <w:b w:val="0"/>
           <w:i w:val="0"/>
         </w:rPr>
-        <w:t>从评论文本到评论网络，研究得到的是对同一批回应的两个侧面描述。角色间语言差异与帖主主导明确回复相互呼应，使“围绕帖主展开的交流”成为一个与结果相容的解释。不过，前者以评论中的规则命中为单位，后者以用户指向事件和边为单位，并未逐条验证二者之间的对应。更不能再跨一步，把这种结构解释成对帖子点赞的促进机制：评论在发帖后形成，研究未确定其与累计点赞的先后关系，也未将网络指标放入点赞回归。对决策者而言，这种区分有实际价值：内容评价需要更可靠的曝光、表达测量和比较条件，互动评价需要人数、次数、角色和时间窗口；它们回答不同问题，可以共同描述社区，却不能用一类指标替代另一类证据。保留这一层次关系，能够使后续方案分别对准尚未解释的内容反馈和已经观察到的回应结构，而不把未经验证的机制写入既定结论。</w:t>
+        <w:t>从评论文本到评论网络，研究得到的是对同一批回应的两个侧面描述。角色间语言差异与帖主主导明确回复相互呼应，使“围绕帖主展开的交流”成为一个与结果相容的解释。直接配对进一步确认了部分根评论与帖主回复之间可核对的词语顺序，但也显示回应内容与回应覆盖并不呈现相同的组间差异。这一补充仍限定于字面规则、直接指向和已采集窗口，没有识别普遍的社会支持机制，更不能把评论结构解释成对帖子点赞的促进机制：评论在发帖后形成，研究未确定其与累计点赞的先后关系，也未将网络指标放入点赞回归。对决策者而言，这种区分有实际价值：内容评价需要更可靠的曝光、表达测量和比较条件，互动评价需要人数、次数、角色和时间窗口；它们回答不同问题，可以共同描述社区，却不能用一类指标替代另一类证据。保留这一层次关系，能够使后续方案分别对准尚未解释的内容反馈和已经观察到的回应结构，而不把未经验证的机制写入既定结论。</w:t>
       </w:r>
     </w:p>
     <w:p>
@@ -6684,8 +7801,8 @@
       <w:r>
         <w:t>6.2 数据与测量边界决定结论的适用范围</w:t>
       </w:r>
-      <w:bookmarkStart w:id="19" w:name="heading_19"/>
-      <w:bookmarkEnd w:id="19"/>
+      <w:bookmarkStart w:id="21" w:name="heading_21"/>
+      <w:bookmarkEnd w:id="21"/>
     </w:p>
     <w:tbl>
       <w:tblPr>
@@ -7019,8 +8136,8 @@
       <w:r>
         <w:t>7. 建议</w:t>
       </w:r>
-      <w:bookmarkStart w:id="20" w:name="heading_20"/>
-      <w:bookmarkEnd w:id="20"/>
+      <w:bookmarkStart w:id="22" w:name="heading_22"/>
+      <w:bookmarkEnd w:id="22"/>
     </w:p>
     <w:p>
       <w:pPr>
@@ -7029,8 +8146,8 @@
       <w:r>
         <w:t>7.1 先改进评价口径，再决定是否干预表达与回应</w:t>
       </w:r>
-      <w:bookmarkStart w:id="21" w:name="heading_21"/>
-      <w:bookmarkEnd w:id="21"/>
+      <w:bookmarkStart w:id="23" w:name="heading_23"/>
+      <w:bookmarkEnd w:id="23"/>
     </w:p>
     <w:tbl>
       <w:tblPr>
@@ -7306,8 +8423,8 @@
       <w:r>
         <w:t>7.2 后续验证优先补齐观察与测量，再评估具体业务方案</w:t>
       </w:r>
-      <w:bookmarkStart w:id="22" w:name="heading_22"/>
-      <w:bookmarkEnd w:id="22"/>
+      <w:bookmarkStart w:id="24" w:name="heading_24"/>
+      <w:bookmarkEnd w:id="24"/>
     </w:p>
     <w:tbl>
       <w:tblPr>
@@ -7586,532 +8703,10 @@
         <w:pStyle w:val="Heading1"/>
       </w:pPr>
       <w:r>
-        <w:t>附录：课程要求与成果对应</w:t>
-      </w:r>
-      <w:bookmarkStart w:id="23" w:name="heading_23"/>
-      <w:bookmarkEnd w:id="23"/>
-    </w:p>
-    <w:tbl>
-      <w:tblPr>
-        <w:tblStyle w:val="LightShading-Accent1"/>
-        <w:tblW w:type="auto" w:w="0"/>
-        <w:tblLook w:firstColumn="1" w:firstRow="1" w:lastColumn="0" w:lastRow="0" w:noHBand="0" w:noVBand="1" w:val="04A0"/>
-      </w:tblPr>
-      <w:tblGrid>
-        <w:gridCol w:w="3251"/>
-        <w:gridCol w:w="3251"/>
-        <w:gridCol w:w="3251"/>
-      </w:tblGrid>
-      <w:tr>
-        <w:trPr>
-          <w:cantSplit/>
-          <w:tblHeader/>
-        </w:trPr>
-        <w:tc>
-          <w:tcPr>
-            <w:tcW w:type="dxa" w:w="3251"/>
-          </w:tcPr>
-          <w:p>
-            <w:pPr>
-              <w:spacing w:line="312" w:lineRule="auto" w:after="60"/>
-            </w:pPr>
-            <w:r>
-              <w:rPr>
-                <w:sz w:val="17"/>
-              </w:rPr>
-              <w:t>作业要求</w:t>
-            </w:r>
-          </w:p>
-        </w:tc>
-        <w:tc>
-          <w:tcPr>
-            <w:tcW w:type="dxa" w:w="3251"/>
-          </w:tcPr>
-          <w:p>
-            <w:pPr>
-              <w:spacing w:line="312" w:lineRule="auto" w:after="60"/>
-            </w:pPr>
-            <w:r>
-              <w:rPr>
-                <w:sz w:val="17"/>
-              </w:rPr>
-              <w:t>本报告中的对应内容</w:t>
-            </w:r>
-          </w:p>
-        </w:tc>
-        <w:tc>
-          <w:tcPr>
-            <w:tcW w:type="dxa" w:w="3251"/>
-          </w:tcPr>
-          <w:p>
-            <w:pPr>
-              <w:spacing w:line="312" w:lineRule="auto" w:after="60"/>
-            </w:pPr>
-            <w:r>
-              <w:rPr>
-                <w:sz w:val="17"/>
-              </w:rPr>
-              <w:t>既有配套材料</w:t>
-            </w:r>
-          </w:p>
-        </w:tc>
-      </w:tr>
-      <w:tr>
-        <w:trPr>
-          <w:cantSplit/>
-        </w:trPr>
-        <w:tc>
-          <w:tcPr>
-            <w:tcW w:type="dxa" w:w="3251"/>
-          </w:tcPr>
-          <w:p>
-            <w:pPr>
-              <w:spacing w:line="312" w:lineRule="auto" w:after="60"/>
-            </w:pPr>
-            <w:r>
-              <w:rPr>
-                <w:sz w:val="17"/>
-              </w:rPr>
-              <w:t>小组成员、研究题目</w:t>
-            </w:r>
-          </w:p>
-        </w:tc>
-        <w:tc>
-          <w:tcPr>
-            <w:tcW w:type="dxa" w:w="3251"/>
-          </w:tcPr>
-          <w:p>
-            <w:pPr>
-              <w:spacing w:line="312" w:lineRule="auto" w:after="60"/>
-            </w:pPr>
-            <w:r>
-              <w:rPr>
-                <w:sz w:val="17"/>
-              </w:rPr>
-              <w:t>首页保留真实信息占位，第一章明确题目与范围</w:t>
-            </w:r>
-          </w:p>
-        </w:tc>
-        <w:tc>
-          <w:tcPr>
-            <w:tcW w:type="dxa" w:w="3251"/>
-          </w:tcPr>
-          <w:p>
-            <w:pPr>
-              <w:spacing w:line="312" w:lineRule="auto" w:after="60"/>
-            </w:pPr>
-            <w:r>
-              <w:rPr>
-                <w:sz w:val="17"/>
-              </w:rPr>
-              <w:t>code/project_config.json中的成员与分工占位</w:t>
-            </w:r>
-          </w:p>
-        </w:tc>
-      </w:tr>
-      <w:tr>
-        <w:trPr>
-          <w:cantSplit/>
-        </w:trPr>
-        <w:tc>
-          <w:tcPr>
-            <w:tcW w:type="dxa" w:w="3251"/>
-          </w:tcPr>
-          <w:p>
-            <w:pPr>
-              <w:spacing w:line="312" w:lineRule="auto" w:after="60"/>
-            </w:pPr>
-            <w:r>
-              <w:rPr>
-                <w:sz w:val="17"/>
-              </w:rPr>
-              <w:t>研究意义</w:t>
-            </w:r>
-          </w:p>
-        </w:tc>
-        <w:tc>
-          <w:tcPr>
-            <w:tcW w:type="dxa" w:w="3251"/>
-          </w:tcPr>
-          <w:p>
-            <w:pPr>
-              <w:spacing w:line="312" w:lineRule="auto" w:after="60"/>
-            </w:pPr>
-            <w:r>
-              <w:rPr>
-                <w:sz w:val="17"/>
-              </w:rPr>
-              <w:t>第二章说明内容反馈与评论互动的研究价值</w:t>
-            </w:r>
-          </w:p>
-        </w:tc>
-        <w:tc>
-          <w:tcPr>
-            <w:tcW w:type="dxa" w:w="3251"/>
-          </w:tcPr>
-          <w:p>
-            <w:pPr>
-              <w:spacing w:line="312" w:lineRule="auto" w:after="60"/>
-            </w:pPr>
-            <w:r>
-              <w:rPr>
-                <w:sz w:val="17"/>
-              </w:rPr>
-              <w:t>既有汇报背景与研究问题</w:t>
-            </w:r>
-          </w:p>
-        </w:tc>
-      </w:tr>
-      <w:tr>
-        <w:trPr>
-          <w:cantSplit/>
-        </w:trPr>
-        <w:tc>
-          <w:tcPr>
-            <w:tcW w:type="dxa" w:w="3251"/>
-          </w:tcPr>
-          <w:p>
-            <w:pPr>
-              <w:spacing w:line="312" w:lineRule="auto" w:after="60"/>
-            </w:pPr>
-            <w:r>
-              <w:rPr>
-                <w:sz w:val="17"/>
-              </w:rPr>
-              <w:t>完整分析过程与描述统计</w:t>
-            </w:r>
-          </w:p>
-        </w:tc>
-        <w:tc>
-          <w:tcPr>
-            <w:tcW w:type="dxa" w:w="3251"/>
-          </w:tcPr>
-          <w:p>
-            <w:pPr>
-              <w:spacing w:line="312" w:lineRule="auto" w:after="60"/>
-            </w:pPr>
-            <w:r>
-              <w:rPr>
-                <w:sz w:val="17"/>
-              </w:rPr>
-              <w:t>第一、三章说明输入、去重、关联、缺失、时间与分布</w:t>
-            </w:r>
-          </w:p>
-        </w:tc>
-        <w:tc>
-          <w:tcPr>
-            <w:tcW w:type="dxa" w:w="3251"/>
-          </w:tcPr>
-          <w:p>
-            <w:pPr>
-              <w:spacing w:line="312" w:lineRule="auto" w:after="60"/>
-            </w:pPr>
-            <w:r>
-              <w:rPr>
-                <w:sz w:val="17"/>
-              </w:rPr>
-              <w:t>分析过程.ipynb及其HTML、结果文件与代码</w:t>
-            </w:r>
-          </w:p>
-        </w:tc>
-      </w:tr>
-      <w:tr>
-        <w:trPr>
-          <w:cantSplit/>
-        </w:trPr>
-        <w:tc>
-          <w:tcPr>
-            <w:tcW w:type="dxa" w:w="3251"/>
-          </w:tcPr>
-          <w:p>
-            <w:pPr>
-              <w:spacing w:line="312" w:lineRule="auto" w:after="60"/>
-            </w:pPr>
-            <w:r>
-              <w:rPr>
-                <w:sz w:val="17"/>
-              </w:rPr>
-              <w:t>非结构化数据转结构化后回归</w:t>
-            </w:r>
-          </w:p>
-        </w:tc>
-        <w:tc>
-          <w:tcPr>
-            <w:tcW w:type="dxa" w:w="3251"/>
-          </w:tcPr>
-          <w:p>
-            <w:pPr>
-              <w:spacing w:line="312" w:lineRule="auto" w:after="60"/>
-            </w:pPr>
-            <w:r>
-              <w:rPr>
-                <w:sz w:val="17"/>
-              </w:rPr>
-              <w:t>第四章说明预处理、词典编码、固定效应、推断与主题回归</w:t>
-            </w:r>
-          </w:p>
-        </w:tc>
-        <w:tc>
-          <w:tcPr>
-            <w:tcW w:type="dxa" w:w="3251"/>
-          </w:tcPr>
-          <w:p>
-            <w:pPr>
-              <w:spacing w:line="312" w:lineRule="auto" w:after="60"/>
-            </w:pPr>
-            <w:r>
-              <w:rPr>
-                <w:sz w:val="17"/>
-              </w:rPr>
-              <w:t>主分析及扩展实验Notebook、词典和模型结果</w:t>
-            </w:r>
-          </w:p>
-        </w:tc>
-      </w:tr>
-      <w:tr>
-        <w:trPr>
-          <w:cantSplit/>
-        </w:trPr>
-        <w:tc>
-          <w:tcPr>
-            <w:tcW w:type="dxa" w:w="3251"/>
-          </w:tcPr>
-          <w:p>
-            <w:pPr>
-              <w:spacing w:line="312" w:lineRule="auto" w:after="60"/>
-            </w:pPr>
-            <w:r>
-              <w:rPr>
-                <w:sz w:val="17"/>
-              </w:rPr>
-              <w:t>至少一种文本或网络分析</w:t>
-            </w:r>
-          </w:p>
-        </w:tc>
-        <w:tc>
-          <w:tcPr>
-            <w:tcW w:type="dxa" w:w="3251"/>
-          </w:tcPr>
-          <w:p>
-            <w:pPr>
-              <w:spacing w:line="312" w:lineRule="auto" w:after="60"/>
-            </w:pPr>
-            <w:r>
-              <w:rPr>
-                <w:sz w:val="17"/>
-              </w:rPr>
-              <w:t>第四章帖子主题；第五章评论文本及互动网络</w:t>
-            </w:r>
-          </w:p>
-        </w:tc>
-        <w:tc>
-          <w:tcPr>
-            <w:tcW w:type="dxa" w:w="3251"/>
-          </w:tcPr>
-          <w:p>
-            <w:pPr>
-              <w:spacing w:line="312" w:lineRule="auto" w:after="60"/>
-            </w:pPr>
-            <w:r>
-              <w:rPr>
-                <w:sz w:val="17"/>
-              </w:rPr>
-              <w:t>评论文本分析Notebook、网络结果和原有图表</w:t>
-            </w:r>
-          </w:p>
-        </w:tc>
-      </w:tr>
-      <w:tr>
-        <w:trPr>
-          <w:cantSplit/>
-        </w:trPr>
-        <w:tc>
-          <w:tcPr>
-            <w:tcW w:type="dxa" w:w="3251"/>
-          </w:tcPr>
-          <w:p>
-            <w:pPr>
-              <w:spacing w:line="312" w:lineRule="auto" w:after="60"/>
-            </w:pPr>
-            <w:r>
-              <w:rPr>
-                <w:sz w:val="17"/>
-              </w:rPr>
-              <w:t>解释与建议</w:t>
-            </w:r>
-          </w:p>
-        </w:tc>
-        <w:tc>
-          <w:tcPr>
-            <w:tcW w:type="dxa" w:w="3251"/>
-          </w:tcPr>
-          <w:p>
-            <w:pPr>
-              <w:spacing w:line="312" w:lineRule="auto" w:after="60"/>
-            </w:pPr>
-            <w:r>
-              <w:rPr>
-                <w:sz w:val="17"/>
-              </w:rPr>
-              <w:t>第六章区分事实与机制，第七章提出有条件的建议</w:t>
-            </w:r>
-          </w:p>
-        </w:tc>
-        <w:tc>
-          <w:tcPr>
-            <w:tcW w:type="dxa" w:w="3251"/>
-          </w:tcPr>
-          <w:p>
-            <w:pPr>
-              <w:spacing w:line="312" w:lineRule="auto" w:after="60"/>
-            </w:pPr>
-            <w:r>
-              <w:rPr>
-                <w:sz w:val="17"/>
-              </w:rPr>
-              <w:t>原有结果和核查记录</w:t>
-            </w:r>
-          </w:p>
-        </w:tc>
-      </w:tr>
-      <w:tr>
-        <w:trPr>
-          <w:cantSplit/>
-        </w:trPr>
-        <w:tc>
-          <w:tcPr>
-            <w:tcW w:type="dxa" w:w="3251"/>
-          </w:tcPr>
-          <w:p>
-            <w:pPr>
-              <w:spacing w:line="312" w:lineRule="auto" w:after="60"/>
-            </w:pPr>
-            <w:r>
-              <w:rPr>
-                <w:sz w:val="17"/>
-              </w:rPr>
-              <w:t>每位成员汇报本人完成部分</w:t>
-            </w:r>
-          </w:p>
-        </w:tc>
-        <w:tc>
-          <w:tcPr>
-            <w:tcW w:type="dxa" w:w="3251"/>
-          </w:tcPr>
-          <w:p>
-            <w:pPr>
-              <w:spacing w:line="312" w:lineRule="auto" w:after="60"/>
-            </w:pPr>
-            <w:r>
-              <w:rPr>
-                <w:sz w:val="17"/>
-              </w:rPr>
-              <w:t>需按真实贡献填写成员、分工并组织汇报</w:t>
-            </w:r>
-          </w:p>
-        </w:tc>
-        <w:tc>
-          <w:tcPr>
-            <w:tcW w:type="dxa" w:w="3251"/>
-          </w:tcPr>
-          <w:p>
-            <w:pPr>
-              <w:spacing w:line="312" w:lineRule="auto" w:after="60"/>
-            </w:pPr>
-            <w:r>
-              <w:rPr>
-                <w:sz w:val="17"/>
-              </w:rPr>
-              <w:t>演示文稿.pptx、演示PDF、汇报讲稿.txt</w:t>
-            </w:r>
-          </w:p>
-        </w:tc>
-      </w:tr>
-      <w:tr>
-        <w:trPr>
-          <w:cantSplit/>
-        </w:trPr>
-        <w:tc>
-          <w:tcPr>
-            <w:tcW w:type="dxa" w:w="3251"/>
-          </w:tcPr>
-          <w:p>
-            <w:pPr>
-              <w:spacing w:line="312" w:lineRule="auto" w:after="60"/>
-            </w:pPr>
-            <w:r>
-              <w:rPr>
-                <w:sz w:val="17"/>
-              </w:rPr>
-              <w:t>PDF、PPT及必要材料提交</w:t>
-            </w:r>
-          </w:p>
-        </w:tc>
-        <w:tc>
-          <w:tcPr>
-            <w:tcW w:type="dxa" w:w="3251"/>
-          </w:tcPr>
-          <w:p>
-            <w:pPr>
-              <w:spacing w:line="312" w:lineRule="auto" w:after="60"/>
-            </w:pPr>
-            <w:r>
-              <w:rPr>
-                <w:sz w:val="17"/>
-              </w:rPr>
-              <w:t>新版报告另存，旧版及其配套文件保留</w:t>
-            </w:r>
-          </w:p>
-        </w:tc>
-        <w:tc>
-          <w:tcPr>
-            <w:tcW w:type="dxa" w:w="3251"/>
-          </w:tcPr>
-          <w:p>
-            <w:pPr>
-              <w:spacing w:line="312" w:lineRule="auto" w:after="60"/>
-            </w:pPr>
-            <w:r>
-              <w:rPr>
-                <w:sz w:val="17"/>
-              </w:rPr>
-              <w:t>项目目录及本地课程提交包</w:t>
-            </w:r>
-          </w:p>
-        </w:tc>
-      </w:tr>
-    </w:tbl>
-    <w:p>
-      <w:pPr>
-        <w:spacing w:after="20"/>
-      </w:pPr>
-    </w:p>
-    <w:p>
-      <w:pPr>
-        <w:jc w:val="both"/>
-      </w:pPr>
-      <w:r>
-        <w:rPr>
-          <w:b w:val="0"/>
-          <w:i w:val="0"/>
-        </w:rPr>
-        <w:t>成员姓名、学号与实际贡献尚未确定，不能以建议分工代替已完成的个人工作。每位成员仍须参与本人部分的汇报，并依据真实贡献独立完成互评。课程作业原文注明11月10日23:59提交、11月15日前互评，但未注明年份，实际期限应以课程通知为准。[10]</w:t>
-      </w:r>
-    </w:p>
-    <w:p>
-      <w:r>
-        <w:br w:type="page"/>
-      </w:r>
-    </w:p>
-    <w:p>
-      <w:pPr>
-        <w:pStyle w:val="Heading1"/>
-      </w:pPr>
-      <w:r>
         <w:t>结论</w:t>
       </w:r>
-      <w:bookmarkStart w:id="24" w:name="heading_24"/>
-      <w:bookmarkEnd w:id="24"/>
+      <w:bookmarkStart w:id="25" w:name="heading_25"/>
+      <w:bookmarkEnd w:id="25"/>
     </w:p>
     <w:p>
       <w:pPr>
@@ -8134,7 +8729,7 @@
           <w:b w:val="0"/>
           <w:i w:val="0"/>
         </w:rPr>
-        <w:t>已采集评论呈现短表达、角色差异、帖主主导明确回复与集中接收并存的特征。这些发现有助于描述反馈如何被表达和分配，但没有证明固定的语言回应链条，也没有识别评论关系对点赞、留存或运动行为的因果影响。</w:t>
+        <w:t>已采集评论呈现短表达、角色差异、帖主主导明确回复与集中接收并存的特征。直接配对观察到部分鼓励与感谢用语的先后对应，但较高的感谢词命中率没有伴随较高的直接回复观察比例。这些发现有助于描述反馈如何被表达和分配，尚未证明普遍的语义回应机制，也没有识别评论关系对点赞、留存或运动行为的因果影响。</w:t>
       </w:r>
     </w:p>
     <w:p>
@@ -8161,8 +8756,8 @@
       <w:r>
         <w:t>参考文献与证据来源</w:t>
       </w:r>
-      <w:bookmarkStart w:id="25" w:name="heading_25"/>
-      <w:bookmarkEnd w:id="25"/>
+      <w:bookmarkStart w:id="26" w:name="heading_26"/>
+      <w:bookmarkEnd w:id="26"/>
     </w:p>
     <w:p>
       <w:pPr>
@@ -8716,7 +9311,82 @@
           <w:b w:val="0"/>
           <w:i w:val="0"/>
         </w:rPr>
-        <w:t>[10] 课程提供资料. 小组项目作业[Z]. [出版地不详]: [发布者不详], [年份不详]. 本地文件：小组项目作业.pdf. 本报告依据其报告内容、展示及提交要求编排。</w:t>
+        <w:t>[10] 本项目小组. 主题作者权重与评论直接回应补充分析[DS]. 2026-10-20. 文件：</w:t>
+      </w:r>
+      <w:hyperlink r:id="rId51">
+        <w:r>
+          <w:rPr>
+            <w:color w:val="32617F"/>
+          </w:rPr>
+          <w:t>supplemental_topic_author_weighting.csv</w:t>
+        </w:r>
+      </w:hyperlink>
+      <w:r>
+        <w:rPr>
+          <w:b w:val="0"/>
+          <w:i w:val="0"/>
+        </w:rPr>
+        <w:t>、</w:t>
+      </w:r>
+      <w:hyperlink r:id="rId52">
+        <w:r>
+          <w:rPr>
+            <w:color w:val="32617F"/>
+          </w:rPr>
+          <w:t>supplemental_direct_reply_language.csv</w:t>
+        </w:r>
+      </w:hyperlink>
+      <w:r>
+        <w:rPr>
+          <w:b w:val="0"/>
+          <w:i w:val="0"/>
+        </w:rPr>
+        <w:t>、</w:t>
+      </w:r>
+      <w:hyperlink r:id="rId53">
+        <w:r>
+          <w:rPr>
+            <w:color w:val="32617F"/>
+          </w:rPr>
+          <w:t>supplemental_summary.json</w:t>
+        </w:r>
+      </w:hyperlink>
+      <w:r>
+        <w:rPr>
+          <w:b w:val="0"/>
+          <w:i w:val="0"/>
+        </w:rPr>
+        <w:t>. 方法、口径与执行输出见</w:t>
+      </w:r>
+      <w:hyperlink r:id="rId54">
+        <w:r>
+          <w:rPr>
+            <w:color w:val="32617F"/>
+          </w:rPr>
+          <w:t>补充分析</w:t>
+        </w:r>
+      </w:hyperlink>
+      <w:r>
+        <w:rPr>
+          <w:b w:val="0"/>
+          <w:i w:val="0"/>
+        </w:rPr>
+        <w:t>，独立复核见</w:t>
+      </w:r>
+      <w:hyperlink r:id="rId55">
+        <w:r>
+          <w:rPr>
+            <w:color w:val="32617F"/>
+          </w:rPr>
+          <w:t>核查记录</w:t>
+        </w:r>
+      </w:hyperlink>
+      <w:r>
+        <w:rPr>
+          <w:b w:val="0"/>
+          <w:i w:val="0"/>
+        </w:rPr>
+        <w:t>.</w:t>
       </w:r>
     </w:p>
     <w:sectPr>

</xml_diff>